<commit_message>
final update of assignment
</commit_message>
<xml_diff>
--- a/module-3/Donohue-M3-Assignment-3_2.docx
+++ b/module-3/Donohue-M3-Assignment-3_2.docx
@@ -428,7 +428,6 @@
         </w:rPr>
         <w:t>Flowchart for “</w:t>
       </w:r>
-      <w:proofErr w:type="spellStart"/>
       <w:r>
         <w:rPr>
           <w:rFonts w:ascii="Times New Roman" w:hAnsi="Times New Roman" w:cs="Times New Roman"/>
@@ -437,7 +436,6 @@
         </w:rPr>
         <w:t>chohan.pay</w:t>
       </w:r>
-      <w:proofErr w:type="spellEnd"/>
       <w:r>
         <w:rPr>
           <w:rFonts w:ascii="Times New Roman" w:hAnsi="Times New Roman" w:cs="Times New Roman"/>
@@ -507,17 +505,49 @@
     <w:p/>
     <w:p/>
     <w:p>
-      <w:proofErr w:type="spellStart"/>
       <w:r>
         <w:lastRenderedPageBreak/>
-        <w:t>Github</w:t>
-      </w:r>
-      <w:proofErr w:type="spellEnd"/>
-      <w:r>
-        <w:t xml:space="preserve"> Upload</w:t>
+        <w:t>Github Upload</w:t>
       </w:r>
       <w:r>
         <w:br/>
+      </w:r>
+      <w:r>
+        <w:drawing>
+          <wp:inline distT="0" distB="0" distL="0" distR="0" wp14:anchorId="41CA0761" wp14:editId="2AEBB0F5">
+            <wp:extent cx="5943600" cy="2915285"/>
+            <wp:effectExtent l="0" t="0" r="0" b="0"/>
+            <wp:docPr id="1738647966" name="Picture 1"/>
+            <wp:cNvGraphicFramePr>
+              <a:graphicFrameLocks xmlns:a="http://schemas.openxmlformats.org/drawingml/2006/main" noChangeAspect="1"/>
+            </wp:cNvGraphicFramePr>
+            <a:graphic xmlns:a="http://schemas.openxmlformats.org/drawingml/2006/main">
+              <a:graphicData uri="http://schemas.openxmlformats.org/drawingml/2006/picture">
+                <pic:pic xmlns:pic="http://schemas.openxmlformats.org/drawingml/2006/picture">
+                  <pic:nvPicPr>
+                    <pic:cNvPr id="1738647966" name=""/>
+                    <pic:cNvPicPr/>
+                  </pic:nvPicPr>
+                  <pic:blipFill>
+                    <a:blip r:embed="rId9"/>
+                    <a:stretch>
+                      <a:fillRect/>
+                    </a:stretch>
+                  </pic:blipFill>
+                  <pic:spPr>
+                    <a:xfrm>
+                      <a:off x="0" y="0"/>
+                      <a:ext cx="5943600" cy="2915285"/>
+                    </a:xfrm>
+                    <a:prstGeom prst="rect">
+                      <a:avLst/>
+                    </a:prstGeom>
+                  </pic:spPr>
+                </pic:pic>
+              </a:graphicData>
+            </a:graphic>
+          </wp:inline>
+        </w:drawing>
       </w:r>
     </w:p>
     <w:p>
@@ -551,7 +581,6 @@
         </w:rPr>
         <w:t xml:space="preserve">Lucid Software. (2025). </w:t>
       </w:r>
-      <w:proofErr w:type="spellStart"/>
       <w:r>
         <w:rPr>
           <w:rFonts w:ascii="Times New Roman" w:hAnsi="Times New Roman" w:cs="Times New Roman"/>
@@ -562,7 +591,6 @@
         </w:rPr>
         <w:t>Lucidchart</w:t>
       </w:r>
-      <w:proofErr w:type="spellEnd"/>
       <w:r>
         <w:rPr>
           <w:rFonts w:ascii="Times New Roman" w:hAnsi="Times New Roman" w:cs="Times New Roman"/>
@@ -571,7 +599,7 @@
         </w:rPr>
         <w:t xml:space="preserve"> [Web-based diagramming tool]. </w:t>
       </w:r>
-      <w:hyperlink r:id="rId9" w:history="1">
+      <w:hyperlink r:id="rId10" w:history="1">
         <w:r>
           <w:rPr>
             <w:rStyle w:val="Hyperlink"/>
@@ -590,10 +618,10 @@
       </w:pPr>
     </w:p>
     <w:sectPr>
-      <w:headerReference w:type="default" r:id="rId10"/>
-      <w:footerReference w:type="default" r:id="rId11"/>
-      <w:headerReference w:type="first" r:id="rId12"/>
-      <w:footerReference w:type="first" r:id="rId13"/>
+      <w:headerReference w:type="default" r:id="rId11"/>
+      <w:footerReference w:type="default" r:id="rId12"/>
+      <w:headerReference w:type="first" r:id="rId13"/>
+      <w:footerReference w:type="first" r:id="rId14"/>
       <w:type w:val="continuous"/>
       <w:pgSz w:w="12240" w:h="15840" w:code="1"/>
       <w:pgMar w:top="1440" w:right="1440" w:bottom="1440" w:left="1440" w:header="720" w:footer="720" w:gutter="0"/>

</xml_diff>